<commit_message>
Fix review gating wording and ship the policy-safe kit files
Google prohibits selectively asking only happy customers for reviews.
Reword the sales letter, the Google Reviews page (system description,
intro, and two FAQ answers), the reviews blog post, and five backlog
posts to ask every customer. Swap in the rebuilt Growth Kit PDF, Word
copy, and free 5 Star Review Kit, which drop the gating scripts and add
a Google review rules box plus opt out wording for automated texts.

Co-Authored-By: Claude Opus 5.5 <noreply@anthropic.com>
</commit_message>
<xml_diff>
--- a/private/growth-kit/The Home Service Growth Kit (editable).docx
+++ b/private/growth-kit/The Home Service Growth Kit (editable).docx
@@ -244,7 +244,7 @@
     </w:p>
     <w:p>
       <w:r>
-        <w:t>The best time to ask for a review is within 2 hours of finishing the job, while the customer is still happy and the fix is fresh. Text beats email for response rate, so lead with text and use email as the backup.</w:t>
+        <w:t>The best time to ask for a review is within 2 hours of finishing the job, while the visit is still fresh in the customer's mind. Text beats email for response rate, so lead with text and use email as the backup.</w:t>
       </w:r>
     </w:p>
     <w:p>
@@ -256,6 +256,26 @@
       </w:r>
       <w:r>
         <w:t xml:space="preserve"> In your Google Business Profile, tap "Ask for reviews" and copy the short link. That link goes wherever you see [Review Link].</w:t>
+      </w:r>
+    </w:p>
+    <w:p>
+      <w:r>
+        <w:rPr>
+          <w:b/>
+        </w:rPr>
+        <w:t>Google's review rules, the short version.</w:t>
+      </w:r>
+      <w:r>
+        <w:t xml:space="preserve"> Ask </w:t>
+      </w:r>
+      <w:r>
+        <w:rPr>
+          <w:b/>
+        </w:rPr>
+        <w:t>every</w:t>
+      </w:r>
+      <w:r>
+        <w:t xml:space="preserve"> customer the same way, not just the ones you think are happy. Google doesn't allow picking only customers you expect to be positive, or steering unhappy customers away from reviewing. Never offer a discount or gift for a review, never write reviews for customers, and never post reviews for your own business. If your texts send automatically, they need opt out wording such as "Reply STOP to opt out." Break these and Google can remove your reviews or suspend your profile.</w:t>
       </w:r>
     </w:p>
     <w:p>
@@ -279,7 +299,7 @@
         <w:pStyle w:val="IntenseQuote"/>
       </w:pPr>
       <w:r>
-        <w:t>Hi [First Name], this is [Your Name] from [Business Name]. Thanks for having us out today! If we did a good job, would you mind leaving a quick review? It takes about 30 seconds and helps us a ton: [Review Link]</w:t>
+        <w:t>Hi [First Name], this is [Your Name] from [Business Name]. Thanks for having us out today! Would you mind leaving a quick review of your experience? It takes about 30 seconds and helps us a ton: [Review Link]</w:t>
       </w:r>
     </w:p>
     <w:p>
@@ -336,10 +356,10 @@
         <w:t>Thanks for trusting [Business Name] with your [job type] today. We're a local business, and reviews from neighbors like you are how new customers find us.</w:t>
         <w:br/>
         <w:br/>
-        <w:t>If you were happy with the work, could you leave a quick review here? [Review Link]</w:t>
+        <w:t>Could you take 30 seconds to leave a quick review of your experience? [Review Link]</w:t>
         <w:br/>
         <w:br/>
-        <w:t>If anything wasn't right, reply to this email and I'll personally make it right.</w:t>
+        <w:t>And if you ever have a question about the work, just reply to this email.</w:t>
         <w:br/>
         <w:br/>
         <w:t>Thanks again,</w:t>
@@ -690,7 +710,7 @@
         <w:t>Before you turn this on: register your number for business texting.</w:t>
       </w:r>
       <w:r>
-        <w:t xml:space="preserve"> US carriers now filter texts from business numbers that aren't registered for A2P 10DLC, and they often block them without telling you. Your auto reply would look like it's working while customers never see it. Most business phone apps and CRMs have a texting registration page in settings. It takes a few days and costs a few dollars in carrier fees. Do it once and you're set.</w:t>
+        <w:t xml:space="preserve"> US carriers now filter texts from business numbers that aren't registered for A2P 10DLC, and they often block them without telling you. Your auto reply would look like it's working while customers never see it. Most business phone apps and CRMs have a texting registration page in settings. It takes a few days and costs a few dollars in carrier fees. Do it once and you're set. Any automated text also needs opt out wording such as "Reply STOP to opt out." Most apps add it for you.</w:t>
       </w:r>
     </w:p>
     <w:p>

</xml_diff>